<commit_message>
DGCAST F3: marking guide aligné sur l'épreuve réellement utilisée
Co-Authored-By: Claude Sonnet 5.5 <noreply@anthropic.com>
Claude-Session: https://claude.ai/code/session_0115LFSb2ktGLWPeVksFkSer
</commit_message>
<xml_diff>
--- a/epreuves/2026-2027/DGCAST_Marking_Guides/DGCAST_F3_Marking_Guide_Seq1_2026-2027.docx
+++ b/epreuves/2026-2027/DGCAST_Marking_Guides/DGCAST_F3_Marking_Guide_Seq1_2026-2027.docx
@@ -302,7 +302,7 @@
                 <w:sz w:val="21"/>
                 <w:szCs w:val="21"/>
               </w:rPr>
-              <w:t xml:space="preserve">Shape of the Earth</w:t>
+              <w:t xml:space="preserve">From the Sun, the Earth is the …</w:t>
             </w:r>
           </w:p>
         </w:tc>
@@ -327,7 +327,7 @@
                 <w:sz w:val="21"/>
                 <w:szCs w:val="21"/>
               </w:rPr>
-              <w:t xml:space="preserve">C: a sphere slightly flattened at the poles</w:t>
+              <w:t xml:space="preserve">C: third planet</w:t>
             </w:r>
           </w:p>
         </w:tc>
@@ -409,7 +409,7 @@
                 <w:sz w:val="21"/>
                 <w:szCs w:val="21"/>
               </w:rPr>
-              <w:t xml:space="preserve">A proof that the Earth is spherical</w:t>
+              <w:t xml:space="preserve">The natural satellite of the Earth</w:t>
             </w:r>
           </w:p>
         </w:tc>
@@ -434,7 +434,7 @@
                 <w:sz w:val="21"/>
                 <w:szCs w:val="21"/>
               </w:rPr>
-              <w:t xml:space="preserve">A: ships disappear gradually below the horizon</w:t>
+              <w:t xml:space="preserve">B: the Moon</w:t>
             </w:r>
           </w:p>
         </w:tc>
@@ -516,7 +516,7 @@
                 <w:sz w:val="21"/>
                 <w:szCs w:val="21"/>
               </w:rPr>
-              <w:t xml:space="preserve">Our galaxy</w:t>
+              <w:t xml:space="preserve">Phase of the Moon when the whole lit face is seen</w:t>
             </w:r>
           </w:p>
         </w:tc>
@@ -541,7 +541,7 @@
                 <w:sz w:val="21"/>
                 <w:szCs w:val="21"/>
               </w:rPr>
-              <w:t xml:space="preserve">A: the Milky Way</w:t>
+              <w:t xml:space="preserve">C: Full Moon</w:t>
             </w:r>
           </w:p>
         </w:tc>
@@ -623,7 +623,7 @@
                 <w:sz w:val="21"/>
                 <w:szCs w:val="21"/>
               </w:rPr>
-              <w:t xml:space="preserve">The pull of the Moon causes the …</w:t>
+              <w:t xml:space="preserve">Circumference of the Earth at the Equator</w:t>
             </w:r>
           </w:p>
         </w:tc>
@@ -648,7 +648,7 @@
                 <w:sz w:val="21"/>
                 <w:szCs w:val="21"/>
               </w:rPr>
-              <w:t xml:space="preserve">A: tides</w:t>
+              <w:t xml:space="preserve">C: 40,000 km (about 40,075 km)</w:t>
             </w:r>
           </w:p>
         </w:tc>
@@ -730,7 +730,7 @@
                 <w:sz w:val="21"/>
                 <w:szCs w:val="21"/>
               </w:rPr>
-              <w:t xml:space="preserve">Latitude 0° is called the …</w:t>
+              <w:t xml:space="preserve">Shape of the Earth</w:t>
             </w:r>
           </w:p>
         </w:tc>
@@ -755,7 +755,7 @@
                 <w:sz w:val="21"/>
                 <w:szCs w:val="21"/>
               </w:rPr>
-              <w:t xml:space="preserve">B: Equator</w:t>
+              <w:t xml:space="preserve">C: a sphere slightly flattened at the poles</w:t>
             </w:r>
           </w:p>
         </w:tc>
@@ -837,7 +837,7 @@
                 <w:sz w:val="21"/>
                 <w:szCs w:val="21"/>
               </w:rPr>
-              <w:t xml:space="preserve">Longitude 0° is called the …</w:t>
+              <w:t xml:space="preserve">A proof that the Earth is spherical</w:t>
             </w:r>
           </w:p>
         </w:tc>
@@ -862,7 +862,7 @@
                 <w:sz w:val="21"/>
                 <w:szCs w:val="21"/>
               </w:rPr>
-              <w:t xml:space="preserve">C: Greenwich (Prime) Meridian</w:t>
+              <w:t xml:space="preserve">A: ships disappear gradually below the horizon</w:t>
             </w:r>
           </w:p>
         </w:tc>
@@ -944,7 +944,7 @@
                 <w:sz w:val="21"/>
                 <w:szCs w:val="21"/>
               </w:rPr>
-              <w:t xml:space="preserve">Which latitude is a great circle?</w:t>
+              <w:t xml:space="preserve">Latitude 0° is called the …</w:t>
             </w:r>
           </w:p>
         </w:tc>
@@ -969,7 +969,7 @@
                 <w:sz w:val="21"/>
                 <w:szCs w:val="21"/>
               </w:rPr>
-              <w:t xml:space="preserve">B: the Equator</w:t>
+              <w:t xml:space="preserve">B: Equator</w:t>
             </w:r>
           </w:p>
         </w:tc>
@@ -1051,7 +1051,7 @@
                 <w:sz w:val="21"/>
                 <w:szCs w:val="21"/>
               </w:rPr>
-              <w:t xml:space="preserve">The International Date Line follows the meridian …</w:t>
+              <w:t xml:space="preserve">Longitude 0° is called the …</w:t>
             </w:r>
           </w:p>
         </w:tc>
@@ -1076,7 +1076,7 @@
                 <w:sz w:val="21"/>
                 <w:szCs w:val="21"/>
               </w:rPr>
-              <w:t xml:space="preserve">D: 180°</w:t>
+              <w:t xml:space="preserve">C: Greenwich (Prime) Meridian</w:t>
             </w:r>
           </w:p>
         </w:tc>
@@ -1158,7 +1158,7 @@
                 <w:sz w:val="21"/>
                 <w:szCs w:val="21"/>
               </w:rPr>
-              <w:t xml:space="preserve">Crossing the International Date Line going west …</w:t>
+              <w:t xml:space="preserve">The Tropic of Cancer is at latitude …</w:t>
             </w:r>
           </w:p>
         </w:tc>
@@ -1183,7 +1183,7 @@
                 <w:sz w:val="21"/>
                 <w:szCs w:val="21"/>
               </w:rPr>
-              <w:t xml:space="preserve">A: adds one day</w:t>
+              <w:t xml:space="preserve">B: 23½° N</w:t>
             </w:r>
           </w:p>
         </w:tc>
@@ -1265,7 +1265,7 @@
                 <w:sz w:val="21"/>
                 <w:szCs w:val="21"/>
               </w:rPr>
-              <w:t xml:space="preserve">In geographical coordinates we write first the …</w:t>
+              <w:t xml:space="preserve">Lines of longitude are also called …</w:t>
             </w:r>
           </w:p>
         </w:tc>
@@ -1290,7 +1290,7 @@
                 <w:sz w:val="21"/>
                 <w:szCs w:val="21"/>
               </w:rPr>
-              <w:t xml:space="preserve">B: latitude</w:t>
+              <w:t xml:space="preserve">B: meridians</w:t>
             </w:r>
           </w:p>
         </w:tc>
@@ -1515,7 +1515,7 @@
                 <w:sz w:val="21"/>
                 <w:szCs w:val="21"/>
               </w:rPr>
-              <w:t xml:space="preserve">1</w:t>
+              <w:t xml:space="preserve">a)</w:t>
             </w:r>
           </w:p>
         </w:tc>
@@ -1558,7 +1558,7 @@
                 <w:sz w:val="21"/>
                 <w:szCs w:val="21"/>
               </w:rPr>
-              <w:t xml:space="preserve"> (accept 9° to 9½° N and 13° to 13½° E, read on the map).</w:t>
+              <w:t xml:space="preserve"> (accept 9° to 9½° N and 12½° to 14° E, read on the map).</w:t>
             </w:r>
           </w:p>
         </w:tc>
@@ -1640,7 +1640,7 @@
                 <w:sz w:val="21"/>
                 <w:szCs w:val="21"/>
               </w:rPr>
-              <w:t xml:space="preserve">2</w:t>
+              <w:t xml:space="preserve">b)</w:t>
             </w:r>
           </w:p>
         </w:tc>
@@ -1683,7 +1683,7 @@
                 <w:sz w:val="21"/>
                 <w:szCs w:val="21"/>
               </w:rPr>
-              <w:t xml:space="preserve"> (accept 4° N and 9½° to 10° E, read on the map).</w:t>
+              <w:t xml:space="preserve"> (accept 4° N and 9½° to 11° E, read on the map).</w:t>
             </w:r>
           </w:p>
         </w:tc>
@@ -2319,6 +2319,33 @@
         </w:tc>
       </w:tr>
     </w:tbl>
+    <w:p>
+      <w:pPr>
+        <w:spacing w:after="50" w:before="40"/>
+      </w:pPr>
+      <w:r>
+        <w:rPr>
+          <w:rFonts w:ascii="Times New Roman" w:cs="Times New Roman" w:eastAsia="Times New Roman" w:hAnsi="Times New Roman"/>
+          <w:b/>
+          <w:bCs/>
+          <w:i/>
+          <w:iCs/>
+          <w:sz w:val="19"/>
+          <w:szCs w:val="19"/>
+        </w:rPr>
+        <w:t xml:space="preserve">Note on the map:</w:t>
+      </w:r>
+      <w:r>
+        <w:rPr>
+          <w:rFonts w:ascii="Times New Roman" w:cs="Times New Roman" w:eastAsia="Times New Roman" w:hAnsi="Times New Roman"/>
+          <w:i/>
+          <w:iCs/>
+          <w:sz w:val="19"/>
+          <w:szCs w:val="19"/>
+        </w:rPr>
+        <w:t xml:space="preserve"> on the printed map, the longitude labels at the top (10° E, 12° E, 14° E, 16° E) are not exactly above the vertical lines, so a candidate may read the longitude about 1° off. This is why a wider tolerance is accepted for the longitude (Garoua 12½° to 14° E; Douala 9½° to 11° E). The latitudes are read correctly.</w:t>
+      </w:r>
+    </w:p>
     <w:p>
       <w:pPr>
         <w:spacing w:after="50" w:before="40"/>

</xml_diff>